<commit_message>
added two versions of draft value charts to data, created a faceted figure of value by position group and day
</commit_message>
<xml_diff>
--- a/draft_pick_value_report.docx
+++ b/draft_pick_value_report.docx
@@ -149,6 +149,51 @@
         </w:rPr>
         <w:lastRenderedPageBreak/>
         <w:t>Introduction</w:t>
+      </w:r>
+    </w:p>
+    <w:p>
+      <w:pPr>
+        <w:rPr>
+          <w:rFonts w:ascii="Garamond" w:hAnsi="Garamond"/>
+          <w:b/>
+          <w:bCs/>
+          <w:sz w:val="28"/>
+          <w:szCs w:val="28"/>
+        </w:rPr>
+      </w:pPr>
+    </w:p>
+    <w:p>
+      <w:pPr>
+        <w:rPr>
+          <w:rFonts w:ascii="Garamond" w:hAnsi="Garamond"/>
+          <w:b/>
+          <w:bCs/>
+          <w:sz w:val="28"/>
+          <w:szCs w:val="28"/>
+        </w:rPr>
+      </w:pPr>
+      <w:r>
+        <w:rPr>
+          <w:rFonts w:ascii="Garamond" w:hAnsi="Garamond"/>
+          <w:b/>
+          <w:bCs/>
+          <w:sz w:val="28"/>
+          <w:szCs w:val="28"/>
+        </w:rPr>
+        <w:t>References</w:t>
+      </w:r>
+    </w:p>
+    <w:p>
+      <w:pPr>
+        <w:rPr>
+          <w:rFonts w:ascii="Garamond" w:hAnsi="Garamond"/>
+        </w:rPr>
+      </w:pPr>
+      <w:r>
+        <w:rPr>
+          <w:rFonts w:ascii="Garamond" w:hAnsi="Garamond"/>
+        </w:rPr>
+        <w:t>Source: Pro-Football-Reference.com for draft data; Fantasycube.com for Jimmy Johnson’s draft chart</w:t>
       </w:r>
     </w:p>
     <w:sectPr>

</xml_diff>

<commit_message>
edited report and draft value charts to accommodate compensatory selections
</commit_message>
<xml_diff>
--- a/draft_pick_value_report.docx
+++ b/draft_pick_value_report.docx
@@ -180,6 +180,67 @@
           <w:sz w:val="28"/>
           <w:szCs w:val="28"/>
         </w:rPr>
+        <w:t>Limitations</w:t>
+      </w:r>
+    </w:p>
+    <w:p>
+      <w:pPr>
+        <w:pStyle w:val="ListParagraph"/>
+        <w:numPr>
+          <w:ilvl w:val="0"/>
+          <w:numId w:val="1"/>
+        </w:numPr>
+        <w:rPr>
+          <w:rFonts w:ascii="Garamond" w:hAnsi="Garamond"/>
+        </w:rPr>
+      </w:pPr>
+      <w:r>
+        <w:rPr>
+          <w:rFonts w:ascii="Garamond" w:hAnsi="Garamond"/>
+        </w:rPr>
+        <w:t>Extrapolated draft pick value for both charts (all 2.0s for Jimmy Johnson’s chart, as the trend was quickly approaching 0; subtracted 0.4 for each subsequent pick on Meers’ chart)</w:t>
+      </w:r>
+    </w:p>
+    <w:p>
+      <w:pPr>
+        <w:rPr>
+          <w:rFonts w:ascii="Garamond" w:hAnsi="Garamond"/>
+          <w:b/>
+          <w:bCs/>
+          <w:sz w:val="28"/>
+          <w:szCs w:val="28"/>
+        </w:rPr>
+      </w:pPr>
+    </w:p>
+    <w:p>
+      <w:pPr>
+        <w:rPr>
+          <w:rFonts w:ascii="Garamond" w:hAnsi="Garamond"/>
+          <w:b/>
+          <w:bCs/>
+          <w:sz w:val="28"/>
+          <w:szCs w:val="28"/>
+        </w:rPr>
+      </w:pPr>
+    </w:p>
+    <w:p>
+      <w:pPr>
+        <w:rPr>
+          <w:rFonts w:ascii="Garamond" w:hAnsi="Garamond"/>
+          <w:b/>
+          <w:bCs/>
+          <w:sz w:val="28"/>
+          <w:szCs w:val="28"/>
+        </w:rPr>
+      </w:pPr>
+      <w:r>
+        <w:rPr>
+          <w:rFonts w:ascii="Garamond" w:hAnsi="Garamond"/>
+          <w:b/>
+          <w:bCs/>
+          <w:sz w:val="28"/>
+          <w:szCs w:val="28"/>
+        </w:rPr>
         <w:t>References</w:t>
       </w:r>
     </w:p>
@@ -195,6 +256,20 @@
         </w:rPr>
         <w:t>Source: Pro-Football-Reference.com for draft data; Fantasycube.com for Jimmy Johnson’s draft chart</w:t>
       </w:r>
+    </w:p>
+    <w:p>
+      <w:pPr>
+        <w:rPr>
+          <w:rFonts w:ascii="Garamond" w:hAnsi="Garamond"/>
+        </w:rPr>
+      </w:pPr>
+    </w:p>
+    <w:p>
+      <w:pPr>
+        <w:rPr>
+          <w:rFonts w:ascii="Garamond" w:hAnsi="Garamond"/>
+        </w:rPr>
+      </w:pPr>
     </w:p>
     <w:sectPr>
       <w:pgSz w:w="12240" w:h="15840"/>
@@ -204,6 +279,103 @@
     </w:sectPr>
   </w:body>
 </w:document>
+</file>
+
+<file path=word/numbering.xml><?xml version="1.0" encoding="utf-8"?>
+<w:numbering xmlns:wpc="http://schemas.microsoft.com/office/word/2010/wordprocessingCanvas" xmlns:cx="http://schemas.microsoft.com/office/drawing/2014/chartex" xmlns:cx1="http://schemas.microsoft.com/office/drawing/2015/9/8/chartex" xmlns:cx2="http://schemas.microsoft.com/office/drawing/2015/10/21/chartex" xmlns:cx3="http://schemas.microsoft.com/office/drawing/2016/5/9/chartex" xmlns:cx4="http://schemas.microsoft.com/office/drawing/2016/5/10/chartex" xmlns:cx5="http://schemas.microsoft.com/office/drawing/2016/5/11/chartex" xmlns:cx6="http://schemas.microsoft.com/office/drawing/2016/5/12/chartex" xmlns:cx7="http://schemas.microsoft.com/office/drawing/2016/5/13/chartex" xmlns:cx8="http://schemas.microsoft.com/office/drawing/2016/5/14/chartex" xmlns:mc="http://schemas.openxmlformats.org/markup-compatibility/2006" xmlns:aink="http://schemas.microsoft.com/office/drawing/2016/ink" xmlns:am3d="http://schemas.microsoft.com/office/drawing/2017/model3d" xmlns:o="urn:schemas-microsoft-com:office:office" xmlns:oel="http://schemas.microsoft.com/office/2019/extlst" xmlns:r="http://schemas.openxmlformats.org/officeDocument/2006/relationships" xmlns:m="http://schemas.openxmlformats.org/officeDocument/2006/math" xmlns:v="urn:schemas-microsoft-com:vml" xmlns:wp14="http://schemas.microsoft.com/office/word/2010/wordprocessingDrawing" xmlns:wp="http://schemas.openxmlformats.org/drawingml/2006/wordprocessingDrawing" xmlns:w10="urn:schemas-microsoft-com:office:word" xmlns:w="http://schemas.openxmlformats.org/wordprocessingml/2006/main" xmlns:w14="http://schemas.microsoft.com/office/word/2010/wordml" xmlns:w15="http://schemas.microsoft.com/office/word/2012/wordml" xmlns:w16cex="http://schemas.microsoft.com/office/word/2018/wordml/cex" xmlns:w16cid="http://schemas.microsoft.com/office/word/2016/wordml/cid" xmlns:w16="http://schemas.microsoft.com/office/word/2018/wordml" xmlns:w16du="http://schemas.microsoft.com/office/word/2023/wordml/word16du" xmlns:w16sdtdh="http://schemas.microsoft.com/office/word/2020/wordml/sdtdatahash" xmlns:w16sdtfl="http://schemas.microsoft.com/office/word/2024/wordml/sdtformatlock" xmlns:w16se="http://schemas.microsoft.com/office/word/2015/wordml/symex" xmlns:wpg="http://schemas.microsoft.com/office/word/2010/wordprocessingGroup" xmlns:wpi="http://schemas.microsoft.com/office/word/2010/wordprocessingInk" xmlns:wne="http://schemas.microsoft.com/office/word/2006/wordml" xmlns:wps="http://schemas.microsoft.com/office/word/2010/wordprocessingShape" mc:Ignorable="w14 w15 w16se w16cid w16 w16cex w16sdtdh w16sdtfl w16du wp14">
+  <w:abstractNum w:abstractNumId="0" w15:restartNumberingAfterBreak="0">
+    <w:nsid w:val="7D655B34"/>
+    <w:multiLevelType w:val="hybridMultilevel"/>
+    <w:tmpl w:val="58C88026"/>
+    <w:lvl w:ilvl="0" w:tplc="04090011">
+      <w:start w:val="1"/>
+      <w:numFmt w:val="decimal"/>
+      <w:lvlText w:val="%1)"/>
+      <w:lvlJc w:val="left"/>
+      <w:pPr>
+        <w:ind w:left="720" w:hanging="360"/>
+      </w:pPr>
+      <w:rPr>
+        <w:rFonts w:hint="default"/>
+      </w:rPr>
+    </w:lvl>
+    <w:lvl w:ilvl="1" w:tplc="04090019" w:tentative="1">
+      <w:start w:val="1"/>
+      <w:numFmt w:val="lowerLetter"/>
+      <w:lvlText w:val="%2."/>
+      <w:lvlJc w:val="left"/>
+      <w:pPr>
+        <w:ind w:left="1440" w:hanging="360"/>
+      </w:pPr>
+    </w:lvl>
+    <w:lvl w:ilvl="2" w:tplc="0409001B" w:tentative="1">
+      <w:start w:val="1"/>
+      <w:numFmt w:val="lowerRoman"/>
+      <w:lvlText w:val="%3."/>
+      <w:lvlJc w:val="right"/>
+      <w:pPr>
+        <w:ind w:left="2160" w:hanging="180"/>
+      </w:pPr>
+    </w:lvl>
+    <w:lvl w:ilvl="3" w:tplc="0409000F" w:tentative="1">
+      <w:start w:val="1"/>
+      <w:numFmt w:val="decimal"/>
+      <w:lvlText w:val="%4."/>
+      <w:lvlJc w:val="left"/>
+      <w:pPr>
+        <w:ind w:left="2880" w:hanging="360"/>
+      </w:pPr>
+    </w:lvl>
+    <w:lvl w:ilvl="4" w:tplc="04090019" w:tentative="1">
+      <w:start w:val="1"/>
+      <w:numFmt w:val="lowerLetter"/>
+      <w:lvlText w:val="%5."/>
+      <w:lvlJc w:val="left"/>
+      <w:pPr>
+        <w:ind w:left="3600" w:hanging="360"/>
+      </w:pPr>
+    </w:lvl>
+    <w:lvl w:ilvl="5" w:tplc="0409001B" w:tentative="1">
+      <w:start w:val="1"/>
+      <w:numFmt w:val="lowerRoman"/>
+      <w:lvlText w:val="%6."/>
+      <w:lvlJc w:val="right"/>
+      <w:pPr>
+        <w:ind w:left="4320" w:hanging="180"/>
+      </w:pPr>
+    </w:lvl>
+    <w:lvl w:ilvl="6" w:tplc="0409000F" w:tentative="1">
+      <w:start w:val="1"/>
+      <w:numFmt w:val="decimal"/>
+      <w:lvlText w:val="%7."/>
+      <w:lvlJc w:val="left"/>
+      <w:pPr>
+        <w:ind w:left="5040" w:hanging="360"/>
+      </w:pPr>
+    </w:lvl>
+    <w:lvl w:ilvl="7" w:tplc="04090019" w:tentative="1">
+      <w:start w:val="1"/>
+      <w:numFmt w:val="lowerLetter"/>
+      <w:lvlText w:val="%8."/>
+      <w:lvlJc w:val="left"/>
+      <w:pPr>
+        <w:ind w:left="5760" w:hanging="360"/>
+      </w:pPr>
+    </w:lvl>
+    <w:lvl w:ilvl="8" w:tplc="0409001B" w:tentative="1">
+      <w:start w:val="1"/>
+      <w:numFmt w:val="lowerRoman"/>
+      <w:lvlText w:val="%9."/>
+      <w:lvlJc w:val="right"/>
+      <w:pPr>
+        <w:ind w:left="6480" w:hanging="180"/>
+      </w:pPr>
+    </w:lvl>
+  </w:abstractNum>
+  <w:num w:numId="1" w16cid:durableId="1010714586">
+    <w:abstractNumId w:val="0"/>
+  </w:num>
+</w:numbering>
 </file>
 
 <file path=word/styles.xml><?xml version="1.0" encoding="utf-8"?>

</xml_diff>

<commit_message>
preparing to build a Shiny dashboard!
</commit_message>
<xml_diff>
--- a/draft_pick_value_report.docx
+++ b/draft_pick_value_report.docx
@@ -148,7 +148,171 @@
           <w:szCs w:val="28"/>
         </w:rPr>
         <w:lastRenderedPageBreak/>
-        <w:t>Introduction</w:t>
+        <w:t>Research Questions</w:t>
+      </w:r>
+    </w:p>
+    <w:p>
+      <w:pPr>
+        <w:pStyle w:val="ListParagraph"/>
+        <w:numPr>
+          <w:ilvl w:val="0"/>
+          <w:numId w:val="3"/>
+        </w:numPr>
+        <w:rPr>
+          <w:rFonts w:ascii="Garamond" w:hAnsi="Garamond"/>
+        </w:rPr>
+      </w:pPr>
+      <w:r>
+        <w:rPr>
+          <w:rFonts w:ascii="Garamond" w:hAnsi="Garamond"/>
+        </w:rPr>
+        <w:t xml:space="preserve">How can </w:t>
+      </w:r>
+      <w:r>
+        <w:rPr>
+          <w:rFonts w:ascii="Garamond" w:hAnsi="Garamond"/>
+        </w:rPr>
+        <w:t>we optimize an algorithm that will assess the relative value of draft picks based on the average trajectory, by position, with each pick?</w:t>
+      </w:r>
+    </w:p>
+    <w:p>
+      <w:pPr>
+        <w:pStyle w:val="ListParagraph"/>
+        <w:numPr>
+          <w:ilvl w:val="0"/>
+          <w:numId w:val="3"/>
+        </w:numPr>
+        <w:rPr>
+          <w:rFonts w:ascii="Garamond" w:hAnsi="Garamond"/>
+        </w:rPr>
+      </w:pPr>
+      <w:r>
+        <w:rPr>
+          <w:rFonts w:ascii="Garamond" w:hAnsi="Garamond"/>
+        </w:rPr>
+        <w:t xml:space="preserve">With respect to draft strategy, how can NFL teams optimize </w:t>
+      </w:r>
+      <w:proofErr w:type="gramStart"/>
+      <w:r>
+        <w:rPr>
+          <w:rFonts w:ascii="Garamond" w:hAnsi="Garamond"/>
+        </w:rPr>
+        <w:t>team-building</w:t>
+      </w:r>
+      <w:proofErr w:type="gramEnd"/>
+      <w:r>
+        <w:rPr>
+          <w:rFonts w:ascii="Garamond" w:hAnsi="Garamond"/>
+        </w:rPr>
+        <w:t xml:space="preserve"> through prioritizing different position groups in different rounds of the draft?</w:t>
+      </w:r>
+    </w:p>
+    <w:p>
+      <w:pPr>
+        <w:pStyle w:val="ListParagraph"/>
+        <w:numPr>
+          <w:ilvl w:val="1"/>
+          <w:numId w:val="3"/>
+        </w:numPr>
+        <w:rPr>
+          <w:rFonts w:ascii="Garamond" w:hAnsi="Garamond"/>
+        </w:rPr>
+      </w:pPr>
+      <w:r>
+        <w:rPr>
+          <w:rFonts w:ascii="Garamond" w:hAnsi="Garamond"/>
+        </w:rPr>
+        <w:t>Do different position groups have different</w:t>
+      </w:r>
+      <w:r>
+        <w:rPr>
+          <w:rFonts w:ascii="Garamond" w:hAnsi="Garamond"/>
+        </w:rPr>
+        <w:t xml:space="preserve"> distributions</w:t>
+      </w:r>
+      <w:r>
+        <w:rPr>
+          <w:rFonts w:ascii="Garamond" w:hAnsi="Garamond"/>
+        </w:rPr>
+        <w:t xml:space="preserve"> of</w:t>
+      </w:r>
+      <w:r>
+        <w:rPr>
+          <w:rFonts w:ascii="Garamond" w:hAnsi="Garamond"/>
+        </w:rPr>
+        <w:t xml:space="preserve"> value by round / day of the draft?</w:t>
+      </w:r>
+    </w:p>
+    <w:p>
+      <w:pPr>
+        <w:pStyle w:val="ListParagraph"/>
+        <w:numPr>
+          <w:ilvl w:val="0"/>
+          <w:numId w:val="3"/>
+        </w:numPr>
+        <w:rPr>
+          <w:rFonts w:ascii="Garamond" w:hAnsi="Garamond"/>
+        </w:rPr>
+      </w:pPr>
+      <w:r>
+        <w:rPr>
+          <w:rFonts w:ascii="Garamond" w:hAnsi="Garamond"/>
+        </w:rPr>
+        <w:t>Which teams have best maximized value based on weighted AV divided by relative value?</w:t>
+      </w:r>
+    </w:p>
+    <w:p>
+      <w:pPr>
+        <w:pStyle w:val="ListParagraph"/>
+        <w:numPr>
+          <w:ilvl w:val="1"/>
+          <w:numId w:val="3"/>
+        </w:numPr>
+        <w:rPr>
+          <w:rFonts w:ascii="Garamond" w:hAnsi="Garamond"/>
+        </w:rPr>
+      </w:pPr>
+      <w:r>
+        <w:rPr>
+          <w:rFonts w:ascii="Garamond" w:hAnsi="Garamond"/>
+        </w:rPr>
+        <w:t>Using Kevin Meers’ algorithm?</w:t>
+      </w:r>
+    </w:p>
+    <w:p>
+      <w:pPr>
+        <w:pStyle w:val="ListParagraph"/>
+        <w:numPr>
+          <w:ilvl w:val="1"/>
+          <w:numId w:val="3"/>
+        </w:numPr>
+        <w:rPr>
+          <w:rFonts w:ascii="Garamond" w:hAnsi="Garamond"/>
+        </w:rPr>
+      </w:pPr>
+      <w:r>
+        <w:rPr>
+          <w:rFonts w:ascii="Garamond" w:hAnsi="Garamond"/>
+        </w:rPr>
+        <w:t>Using our own algorithm?</w:t>
+      </w:r>
+    </w:p>
+    <w:p>
+      <w:pPr>
+        <w:pStyle w:val="ListParagraph"/>
+        <w:numPr>
+          <w:ilvl w:val="1"/>
+          <w:numId w:val="3"/>
+        </w:numPr>
+        <w:rPr>
+          <w:rFonts w:ascii="Garamond" w:hAnsi="Garamond"/>
+        </w:rPr>
+      </w:pPr>
+      <w:r>
+        <w:rPr>
+          <w:rFonts w:ascii="Garamond" w:hAnsi="Garamond"/>
+        </w:rPr>
+        <w:t>What patterns emerge from viewing trends team-by-team? Do the most successful draft classes, on average, have many lower-value picks, a few higher-value picks, or something in between?</w:t>
       </w:r>
     </w:p>
     <w:p>
@@ -180,7 +344,57 @@
           <w:sz w:val="28"/>
           <w:szCs w:val="28"/>
         </w:rPr>
+        <w:t>Introduction</w:t>
+      </w:r>
+    </w:p>
+    <w:p>
+      <w:pPr>
+        <w:rPr>
+          <w:rFonts w:ascii="Garamond" w:hAnsi="Garamond"/>
+          <w:b/>
+          <w:bCs/>
+          <w:sz w:val="28"/>
+          <w:szCs w:val="28"/>
+        </w:rPr>
+      </w:pPr>
+    </w:p>
+    <w:p>
+      <w:pPr>
+        <w:rPr>
+          <w:rFonts w:ascii="Garamond" w:hAnsi="Garamond"/>
+          <w:b/>
+          <w:bCs/>
+          <w:sz w:val="28"/>
+          <w:szCs w:val="28"/>
+        </w:rPr>
+      </w:pPr>
+      <w:r>
+        <w:rPr>
+          <w:rFonts w:ascii="Garamond" w:hAnsi="Garamond"/>
+          <w:b/>
+          <w:bCs/>
+          <w:sz w:val="28"/>
+          <w:szCs w:val="28"/>
+        </w:rPr>
         <w:t>Limitations</w:t>
+      </w:r>
+    </w:p>
+    <w:p>
+      <w:pPr>
+        <w:pStyle w:val="ListParagraph"/>
+        <w:numPr>
+          <w:ilvl w:val="0"/>
+          <w:numId w:val="1"/>
+        </w:numPr>
+        <w:rPr>
+          <w:rFonts w:ascii="Garamond" w:hAnsi="Garamond"/>
+        </w:rPr>
+      </w:pPr>
+      <w:r>
+        <w:rPr>
+          <w:rFonts w:ascii="Garamond" w:hAnsi="Garamond"/>
+        </w:rPr>
+        <w:t>Weighted AV is inherently a limited, though convenient, one-off metric for value</w:t>
       </w:r>
     </w:p>
     <w:p>
@@ -284,6 +498,184 @@
 <file path=word/numbering.xml><?xml version="1.0" encoding="utf-8"?>
 <w:numbering xmlns:wpc="http://schemas.microsoft.com/office/word/2010/wordprocessingCanvas" xmlns:cx="http://schemas.microsoft.com/office/drawing/2014/chartex" xmlns:cx1="http://schemas.microsoft.com/office/drawing/2015/9/8/chartex" xmlns:cx2="http://schemas.microsoft.com/office/drawing/2015/10/21/chartex" xmlns:cx3="http://schemas.microsoft.com/office/drawing/2016/5/9/chartex" xmlns:cx4="http://schemas.microsoft.com/office/drawing/2016/5/10/chartex" xmlns:cx5="http://schemas.microsoft.com/office/drawing/2016/5/11/chartex" xmlns:cx6="http://schemas.microsoft.com/office/drawing/2016/5/12/chartex" xmlns:cx7="http://schemas.microsoft.com/office/drawing/2016/5/13/chartex" xmlns:cx8="http://schemas.microsoft.com/office/drawing/2016/5/14/chartex" xmlns:mc="http://schemas.openxmlformats.org/markup-compatibility/2006" xmlns:aink="http://schemas.microsoft.com/office/drawing/2016/ink" xmlns:am3d="http://schemas.microsoft.com/office/drawing/2017/model3d" xmlns:o="urn:schemas-microsoft-com:office:office" xmlns:oel="http://schemas.microsoft.com/office/2019/extlst" xmlns:r="http://schemas.openxmlformats.org/officeDocument/2006/relationships" xmlns:m="http://schemas.openxmlformats.org/officeDocument/2006/math" xmlns:v="urn:schemas-microsoft-com:vml" xmlns:wp14="http://schemas.microsoft.com/office/word/2010/wordprocessingDrawing" xmlns:wp="http://schemas.openxmlformats.org/drawingml/2006/wordprocessingDrawing" xmlns:w10="urn:schemas-microsoft-com:office:word" xmlns:w="http://schemas.openxmlformats.org/wordprocessingml/2006/main" xmlns:w14="http://schemas.microsoft.com/office/word/2010/wordml" xmlns:w15="http://schemas.microsoft.com/office/word/2012/wordml" xmlns:w16cex="http://schemas.microsoft.com/office/word/2018/wordml/cex" xmlns:w16cid="http://schemas.microsoft.com/office/word/2016/wordml/cid" xmlns:w16="http://schemas.microsoft.com/office/word/2018/wordml" xmlns:w16du="http://schemas.microsoft.com/office/word/2023/wordml/word16du" xmlns:w16sdtdh="http://schemas.microsoft.com/office/word/2020/wordml/sdtdatahash" xmlns:w16sdtfl="http://schemas.microsoft.com/office/word/2024/wordml/sdtformatlock" xmlns:w16se="http://schemas.microsoft.com/office/word/2015/wordml/symex" xmlns:wpg="http://schemas.microsoft.com/office/word/2010/wordprocessingGroup" xmlns:wpi="http://schemas.microsoft.com/office/word/2010/wordprocessingInk" xmlns:wne="http://schemas.microsoft.com/office/word/2006/wordml" xmlns:wps="http://schemas.microsoft.com/office/word/2010/wordprocessingShape" mc:Ignorable="w14 w15 w16se w16cid w16 w16cex w16sdtdh w16sdtfl w16du wp14">
   <w:abstractNum w:abstractNumId="0" w15:restartNumberingAfterBreak="0">
+    <w:nsid w:val="10525985"/>
+    <w:multiLevelType w:val="hybridMultilevel"/>
+    <w:tmpl w:val="BDFE51C6"/>
+    <w:lvl w:ilvl="0" w:tplc="04090011">
+      <w:start w:val="1"/>
+      <w:numFmt w:val="decimal"/>
+      <w:lvlText w:val="%1)"/>
+      <w:lvlJc w:val="left"/>
+      <w:pPr>
+        <w:ind w:left="720" w:hanging="360"/>
+      </w:pPr>
+      <w:rPr>
+        <w:rFonts w:hint="default"/>
+      </w:rPr>
+    </w:lvl>
+    <w:lvl w:ilvl="1" w:tplc="04090019">
+      <w:start w:val="1"/>
+      <w:numFmt w:val="lowerLetter"/>
+      <w:lvlText w:val="%2."/>
+      <w:lvlJc w:val="left"/>
+      <w:pPr>
+        <w:ind w:left="1440" w:hanging="360"/>
+      </w:pPr>
+    </w:lvl>
+    <w:lvl w:ilvl="2" w:tplc="0409001B" w:tentative="1">
+      <w:start w:val="1"/>
+      <w:numFmt w:val="lowerRoman"/>
+      <w:lvlText w:val="%3."/>
+      <w:lvlJc w:val="right"/>
+      <w:pPr>
+        <w:ind w:left="2160" w:hanging="180"/>
+      </w:pPr>
+    </w:lvl>
+    <w:lvl w:ilvl="3" w:tplc="0409000F" w:tentative="1">
+      <w:start w:val="1"/>
+      <w:numFmt w:val="decimal"/>
+      <w:lvlText w:val="%4."/>
+      <w:lvlJc w:val="left"/>
+      <w:pPr>
+        <w:ind w:left="2880" w:hanging="360"/>
+      </w:pPr>
+    </w:lvl>
+    <w:lvl w:ilvl="4" w:tplc="04090019" w:tentative="1">
+      <w:start w:val="1"/>
+      <w:numFmt w:val="lowerLetter"/>
+      <w:lvlText w:val="%5."/>
+      <w:lvlJc w:val="left"/>
+      <w:pPr>
+        <w:ind w:left="3600" w:hanging="360"/>
+      </w:pPr>
+    </w:lvl>
+    <w:lvl w:ilvl="5" w:tplc="0409001B" w:tentative="1">
+      <w:start w:val="1"/>
+      <w:numFmt w:val="lowerRoman"/>
+      <w:lvlText w:val="%6."/>
+      <w:lvlJc w:val="right"/>
+      <w:pPr>
+        <w:ind w:left="4320" w:hanging="180"/>
+      </w:pPr>
+    </w:lvl>
+    <w:lvl w:ilvl="6" w:tplc="0409000F" w:tentative="1">
+      <w:start w:val="1"/>
+      <w:numFmt w:val="decimal"/>
+      <w:lvlText w:val="%7."/>
+      <w:lvlJc w:val="left"/>
+      <w:pPr>
+        <w:ind w:left="5040" w:hanging="360"/>
+      </w:pPr>
+    </w:lvl>
+    <w:lvl w:ilvl="7" w:tplc="04090019" w:tentative="1">
+      <w:start w:val="1"/>
+      <w:numFmt w:val="lowerLetter"/>
+      <w:lvlText w:val="%8."/>
+      <w:lvlJc w:val="left"/>
+      <w:pPr>
+        <w:ind w:left="5760" w:hanging="360"/>
+      </w:pPr>
+    </w:lvl>
+    <w:lvl w:ilvl="8" w:tplc="0409001B" w:tentative="1">
+      <w:start w:val="1"/>
+      <w:numFmt w:val="lowerRoman"/>
+      <w:lvlText w:val="%9."/>
+      <w:lvlJc w:val="right"/>
+      <w:pPr>
+        <w:ind w:left="6480" w:hanging="180"/>
+      </w:pPr>
+    </w:lvl>
+  </w:abstractNum>
+  <w:abstractNum w:abstractNumId="1" w15:restartNumberingAfterBreak="0">
+    <w:nsid w:val="25085D5B"/>
+    <w:multiLevelType w:val="hybridMultilevel"/>
+    <w:tmpl w:val="378414B6"/>
+    <w:lvl w:ilvl="0" w:tplc="04090011">
+      <w:start w:val="1"/>
+      <w:numFmt w:val="decimal"/>
+      <w:lvlText w:val="%1)"/>
+      <w:lvlJc w:val="left"/>
+      <w:pPr>
+        <w:ind w:left="720" w:hanging="360"/>
+      </w:pPr>
+      <w:rPr>
+        <w:rFonts w:hint="default"/>
+      </w:rPr>
+    </w:lvl>
+    <w:lvl w:ilvl="1" w:tplc="04090019" w:tentative="1">
+      <w:start w:val="1"/>
+      <w:numFmt w:val="lowerLetter"/>
+      <w:lvlText w:val="%2."/>
+      <w:lvlJc w:val="left"/>
+      <w:pPr>
+        <w:ind w:left="1440" w:hanging="360"/>
+      </w:pPr>
+    </w:lvl>
+    <w:lvl w:ilvl="2" w:tplc="0409001B" w:tentative="1">
+      <w:start w:val="1"/>
+      <w:numFmt w:val="lowerRoman"/>
+      <w:lvlText w:val="%3."/>
+      <w:lvlJc w:val="right"/>
+      <w:pPr>
+        <w:ind w:left="2160" w:hanging="180"/>
+      </w:pPr>
+    </w:lvl>
+    <w:lvl w:ilvl="3" w:tplc="0409000F" w:tentative="1">
+      <w:start w:val="1"/>
+      <w:numFmt w:val="decimal"/>
+      <w:lvlText w:val="%4."/>
+      <w:lvlJc w:val="left"/>
+      <w:pPr>
+        <w:ind w:left="2880" w:hanging="360"/>
+      </w:pPr>
+    </w:lvl>
+    <w:lvl w:ilvl="4" w:tplc="04090019" w:tentative="1">
+      <w:start w:val="1"/>
+      <w:numFmt w:val="lowerLetter"/>
+      <w:lvlText w:val="%5."/>
+      <w:lvlJc w:val="left"/>
+      <w:pPr>
+        <w:ind w:left="3600" w:hanging="360"/>
+      </w:pPr>
+    </w:lvl>
+    <w:lvl w:ilvl="5" w:tplc="0409001B" w:tentative="1">
+      <w:start w:val="1"/>
+      <w:numFmt w:val="lowerRoman"/>
+      <w:lvlText w:val="%6."/>
+      <w:lvlJc w:val="right"/>
+      <w:pPr>
+        <w:ind w:left="4320" w:hanging="180"/>
+      </w:pPr>
+    </w:lvl>
+    <w:lvl w:ilvl="6" w:tplc="0409000F" w:tentative="1">
+      <w:start w:val="1"/>
+      <w:numFmt w:val="decimal"/>
+      <w:lvlText w:val="%7."/>
+      <w:lvlJc w:val="left"/>
+      <w:pPr>
+        <w:ind w:left="5040" w:hanging="360"/>
+      </w:pPr>
+    </w:lvl>
+    <w:lvl w:ilvl="7" w:tplc="04090019" w:tentative="1">
+      <w:start w:val="1"/>
+      <w:numFmt w:val="lowerLetter"/>
+      <w:lvlText w:val="%8."/>
+      <w:lvlJc w:val="left"/>
+      <w:pPr>
+        <w:ind w:left="5760" w:hanging="360"/>
+      </w:pPr>
+    </w:lvl>
+    <w:lvl w:ilvl="8" w:tplc="0409001B" w:tentative="1">
+      <w:start w:val="1"/>
+      <w:numFmt w:val="lowerRoman"/>
+      <w:lvlText w:val="%9."/>
+      <w:lvlJc w:val="right"/>
+      <w:pPr>
+        <w:ind w:left="6480" w:hanging="180"/>
+      </w:pPr>
+    </w:lvl>
+  </w:abstractNum>
+  <w:abstractNum w:abstractNumId="2" w15:restartNumberingAfterBreak="0">
     <w:nsid w:val="7D655B34"/>
     <w:multiLevelType w:val="hybridMultilevel"/>
     <w:tmpl w:val="58C88026"/>
@@ -373,6 +765,12 @@
     </w:lvl>
   </w:abstractNum>
   <w:num w:numId="1" w16cid:durableId="1010714586">
+    <w:abstractNumId w:val="2"/>
+  </w:num>
+  <w:num w:numId="2" w16cid:durableId="677076995">
+    <w:abstractNumId w:val="1"/>
+  </w:num>
+  <w:num w:numId="3" w16cid:durableId="1676226545">
     <w:abstractNumId w:val="0"/>
   </w:num>
 </w:numbering>

</xml_diff>